<commit_message>
Perbaiki download dan submit usulan perubahan
</commit_message>
<xml_diff>
--- a/output/Laporan_Insiden_INS-20260120-101254_14.docx
+++ b/output/Laporan_Insiden_INS-20260120-101254_14.docx
@@ -261,23 +261,31 @@
             <w:pPr>
               <w:rPr>
                 <w:rFonts w:ascii="Times New Roman" w:hAnsi="Times New Roman" w:cs="Times New Roman"/>
+                <w:sz w:val="20"/>
+                <w:szCs w:val="20"/>
               </w:rPr>
             </w:pPr>
             <w:r>
               <w:rPr>
                 <w:rFonts w:ascii="Times New Roman" w:hAnsi="Times New Roman" w:cs="Times New Roman"/>
+                <w:sz w:val="20"/>
+                <w:szCs w:val="20"/>
               </w:rPr>
               <w:t>N</w:t>
             </w:r>
             <w:r>
               <w:rPr>
                 <w:rFonts w:ascii="Times New Roman" w:hAnsi="Times New Roman" w:cs="Times New Roman"/>
+                <w:sz w:val="20"/>
+                <w:szCs w:val="20"/>
               </w:rPr>
               <w:t>o</w:t>
             </w:r>
             <w:r>
               <w:rPr>
                 <w:rFonts w:ascii="Times New Roman" w:hAnsi="Times New Roman" w:cs="Times New Roman"/>
+                <w:sz w:val="20"/>
+                <w:szCs w:val="20"/>
               </w:rPr>
               <w:t>. Dok</w:t>
             </w:r>
@@ -297,11 +305,15 @@
             <w:pPr>
               <w:rPr>
                 <w:rFonts w:ascii="Times New Roman" w:hAnsi="Times New Roman" w:cs="Times New Roman"/>
+                <w:sz w:val="20"/>
+                <w:szCs w:val="20"/>
               </w:rPr>
             </w:pPr>
             <w:r>
               <w:rPr>
                 <w:rFonts w:ascii="Times New Roman" w:hAnsi="Times New Roman" w:cs="Times New Roman"/>
+                <w:sz w:val="20"/>
+                <w:szCs w:val="20"/>
               </w:rPr>
               <w:t>:</w:t>
             </w:r>
@@ -321,13 +333,26 @@
             <w:pPr>
               <w:rPr>
                 <w:rFonts w:ascii="Times New Roman" w:hAnsi="Times New Roman" w:cs="Times New Roman"/>
+                <w:sz w:val="20"/>
+                <w:szCs w:val="20"/>
               </w:rPr>
             </w:pPr>
             <w:r>
               <w:rPr>
                 <w:rFonts w:ascii="Times New Roman" w:hAnsi="Times New Roman" w:cs="Times New Roman"/>
-              </w:rPr>
-              <w:t xml:space="preserve">987               </w:t>
+                <w:sz w:val="20"/>
+                <w:szCs w:val="20"/>
+              </w:rPr>
+              <w:t xml:space="preserve">987   </w:t>
+            </w:r>
+            <w:proofErr w:type="gramEnd"/>
+            <w:r>
+              <w:rPr>
+                <w:rFonts w:ascii="Times New Roman" w:hAnsi="Times New Roman" w:cs="Times New Roman"/>
+                <w:sz w:val="20"/>
+                <w:szCs w:val="20"/>
+              </w:rPr>
+              <w:t xml:space="preserve">            </w:t>
             </w:r>
           </w:p>
         </w:tc>
@@ -369,11 +394,15 @@
             <w:pPr>
               <w:rPr>
                 <w:rFonts w:ascii="Times New Roman" w:hAnsi="Times New Roman" w:cs="Times New Roman"/>
+                <w:sz w:val="20"/>
+                <w:szCs w:val="20"/>
               </w:rPr>
             </w:pPr>
             <w:r>
               <w:rPr>
                 <w:rFonts w:ascii="Times New Roman" w:hAnsi="Times New Roman" w:cs="Times New Roman"/>
+                <w:sz w:val="20"/>
+                <w:szCs w:val="20"/>
               </w:rPr>
               <w:t xml:space="preserve">No. </w:t>
             </w:r>
@@ -381,6 +410,8 @@
             <w:r>
               <w:rPr>
                 <w:rFonts w:ascii="Times New Roman" w:hAnsi="Times New Roman" w:cs="Times New Roman"/>
+                <w:sz w:val="20"/>
+                <w:szCs w:val="20"/>
               </w:rPr>
               <w:t>Revisi</w:t>
             </w:r>
@@ -401,11 +432,15 @@
             <w:pPr>
               <w:rPr>
                 <w:rFonts w:ascii="Times New Roman" w:hAnsi="Times New Roman" w:cs="Times New Roman"/>
+                <w:sz w:val="20"/>
+                <w:szCs w:val="20"/>
               </w:rPr>
             </w:pPr>
             <w:r>
               <w:rPr>
                 <w:rFonts w:ascii="Times New Roman" w:hAnsi="Times New Roman" w:cs="Times New Roman"/>
+                <w:sz w:val="20"/>
+                <w:szCs w:val="20"/>
               </w:rPr>
               <w:t>:</w:t>
             </w:r>
@@ -425,13 +460,26 @@
             <w:pPr>
               <w:rPr>
                 <w:rFonts w:ascii="Times New Roman" w:hAnsi="Times New Roman" w:cs="Times New Roman"/>
+                <w:sz w:val="20"/>
+                <w:szCs w:val="20"/>
               </w:rPr>
             </w:pPr>
             <w:r>
               <w:rPr>
                 <w:rFonts w:ascii="Times New Roman" w:hAnsi="Times New Roman" w:cs="Times New Roman"/>
-              </w:rPr>
-              <w:t xml:space="preserve">3            </w:t>
+                <w:sz w:val="20"/>
+                <w:szCs w:val="20"/>
+              </w:rPr>
+              <w:t xml:space="preserve">3   </w:t>
+            </w:r>
+            <w:proofErr w:type="gramEnd"/>
+            <w:r>
+              <w:rPr>
+                <w:rFonts w:ascii="Times New Roman" w:hAnsi="Times New Roman" w:cs="Times New Roman"/>
+                <w:sz w:val="20"/>
+                <w:szCs w:val="20"/>
+              </w:rPr>
+              <w:t xml:space="preserve">         </w:t>
             </w:r>
           </w:p>
         </w:tc>
@@ -475,16 +523,46 @@
             <w:pPr>
               <w:rPr>
                 <w:rFonts w:ascii="Times New Roman" w:hAnsi="Times New Roman" w:cs="Times New Roman"/>
+                <w:sz w:val="20"/>
+                <w:szCs w:val="20"/>
               </w:rPr>
             </w:pPr>
             <w:proofErr w:type="spellStart"/>
             <w:r>
               <w:rPr>
                 <w:rFonts w:ascii="Times New Roman" w:hAnsi="Times New Roman" w:cs="Times New Roman"/>
-              </w:rPr>
-              <w:t>Tgl.Efektif</w:t>
+                <w:sz w:val="20"/>
+                <w:szCs w:val="20"/>
+              </w:rPr>
+              <w:t>Tgl</w:t>
             </w:r>
             <w:proofErr w:type="spellEnd"/>
+            <w:r>
+              <w:rPr>
+                <w:rFonts w:ascii="Times New Roman" w:hAnsi="Times New Roman" w:cs="Times New Roman"/>
+                <w:sz w:val="20"/>
+                <w:szCs w:val="20"/>
+              </w:rPr>
+              <w:t>.</w:t>
+            </w:r>
+            <w:r>
+              <w:rPr>
+                <w:rFonts w:ascii="Times New Roman" w:hAnsi="Times New Roman" w:cs="Times New Roman"/>
+                <w:sz w:val="20"/>
+                <w:szCs w:val="20"/>
+              </w:rPr>
+              <w:t xml:space="preserve"> </w:t>
+            </w:r>
+            <w:proofErr w:type="spellStart"/>
+            <w:r>
+              <w:rPr>
+                <w:rFonts w:ascii="Times New Roman" w:hAnsi="Times New Roman" w:cs="Times New Roman"/>
+                <w:sz w:val="20"/>
+                <w:szCs w:val="20"/>
+              </w:rPr>
+              <w:t>Efektif</w:t>
+            </w:r>
+            <w:proofErr w:type="spellEnd"/>
           </w:p>
         </w:tc>
         <w:tc>
@@ -501,11 +579,15 @@
             <w:pPr>
               <w:rPr>
                 <w:rFonts w:ascii="Times New Roman" w:hAnsi="Times New Roman" w:cs="Times New Roman"/>
+                <w:sz w:val="20"/>
+                <w:szCs w:val="20"/>
               </w:rPr>
             </w:pPr>
             <w:r>
               <w:rPr>
                 <w:rFonts w:ascii="Times New Roman" w:hAnsi="Times New Roman" w:cs="Times New Roman"/>
+                <w:sz w:val="20"/>
+                <w:szCs w:val="20"/>
               </w:rPr>
               <w:t>:</w:t>
             </w:r>
@@ -525,13 +607,26 @@
             <w:pPr>
               <w:rPr>
                 <w:rFonts w:ascii="Times New Roman" w:hAnsi="Times New Roman" w:cs="Times New Roman"/>
+                <w:sz w:val="20"/>
+                <w:szCs w:val="20"/>
               </w:rPr>
             </w:pPr>
             <w:r>
               <w:rPr>
                 <w:rFonts w:ascii="Times New Roman" w:hAnsi="Times New Roman" w:cs="Times New Roman"/>
-              </w:rPr>
-              <w:t xml:space="preserve">Rabu, 21 Januari 2026          </w:t>
+                <w:sz w:val="20"/>
+                <w:szCs w:val="20"/>
+              </w:rPr>
+              <w:t xml:space="preserve">Rabu, 21 Januari 2026   </w:t>
+            </w:r>
+            <w:proofErr w:type="gramEnd"/>
+            <w:r>
+              <w:rPr>
+                <w:rFonts w:ascii="Times New Roman" w:hAnsi="Times New Roman" w:cs="Times New Roman"/>
+                <w:sz w:val="20"/>
+                <w:szCs w:val="20"/>
+              </w:rPr>
+              <w:t xml:space="preserve">       </w:t>
             </w:r>
           </w:p>
         </w:tc>
@@ -568,13 +663,25 @@
           <w:p>
             <w:pPr>
               <w:spacing w:line="360" w:lineRule="auto"/>
+              <w:rPr>
+                <w:sz w:val="24"/>
+                <w:szCs w:val="24"/>
+              </w:rPr>
             </w:pPr>
             <w:bookmarkStart w:id="1" w:name="_Hlk219797341"/>
             <w:r>
+              <w:rPr>
+                <w:sz w:val="24"/>
+                <w:szCs w:val="24"/>
+              </w:rPr>
               <w:t xml:space="preserve">No. </w:t>
             </w:r>
             <w:proofErr w:type="spellStart"/>
             <w:r>
+              <w:rPr>
+                <w:sz w:val="24"/>
+                <w:szCs w:val="24"/>
+              </w:rPr>
               <w:t>Permohonan</w:t>
             </w:r>
             <w:proofErr w:type="spellEnd"/>
@@ -593,8 +700,16 @@
           <w:p>
             <w:pPr>
               <w:spacing w:line="360" w:lineRule="auto"/>
-            </w:pPr>
-            <w:r>
+              <w:rPr>
+                <w:sz w:val="24"/>
+                <w:szCs w:val="24"/>
+              </w:rPr>
+            </w:pPr>
+            <w:r>
+              <w:rPr>
+                <w:sz w:val="24"/>
+                <w:szCs w:val="24"/>
+              </w:rPr>
               <w:t>:</w:t>
             </w:r>
           </w:p>
@@ -613,9 +728,25 @@
           <w:p>
             <w:pPr>
               <w:spacing w:line="360" w:lineRule="auto"/>
-            </w:pPr>
-            <w:r>
-              <w:t xml:space="preserve">INS-20260120-101254                                            </w:t>
+              <w:rPr>
+                <w:sz w:val="24"/>
+                <w:szCs w:val="24"/>
+              </w:rPr>
+            </w:pPr>
+            <w:r>
+              <w:rPr>
+                <w:sz w:val="24"/>
+                <w:szCs w:val="24"/>
+              </w:rPr>
+              <w:t xml:space="preserve">INS-20260120-101254   </w:t>
+            </w:r>
+            <w:proofErr w:type="gramEnd"/>
+            <w:r>
+              <w:rPr>
+                <w:sz w:val="24"/>
+                <w:szCs w:val="24"/>
+              </w:rPr>
+              <w:t xml:space="preserve">                                         </w:t>
             </w:r>
           </w:p>
         </w:tc>
@@ -640,6 +771,8 @@
               <w:rPr>
                 <w:b/>
                 <w:bCs/>
+                <w:sz w:val="24"/>
+                <w:szCs w:val="24"/>
               </w:rPr>
             </w:pPr>
             <w:proofErr w:type="spellStart"/>
@@ -647,6 +780,8 @@
               <w:rPr>
                 <w:b/>
                 <w:bCs/>
+                <w:sz w:val="24"/>
+                <w:szCs w:val="24"/>
               </w:rPr>
               <w:t>Diisi</w:t>
             </w:r>
@@ -655,6 +790,8 @@
               <w:rPr>
                 <w:b/>
                 <w:bCs/>
+                <w:sz w:val="24"/>
+                <w:szCs w:val="24"/>
               </w:rPr>
               <w:t xml:space="preserve"> Oleh </w:t>
             </w:r>
@@ -663,6 +800,8 @@
               <w:rPr>
                 <w:b/>
                 <w:bCs/>
+                <w:sz w:val="24"/>
+                <w:szCs w:val="24"/>
               </w:rPr>
               <w:t>Pelapor</w:t>
             </w:r>
@@ -671,6 +810,8 @@
               <w:rPr>
                 <w:b/>
                 <w:bCs/>
+                <w:sz w:val="24"/>
+                <w:szCs w:val="24"/>
               </w:rPr>
               <w:tab/>
             </w:r>
@@ -689,21 +830,41 @@
           <w:p>
             <w:pPr>
               <w:spacing w:line="360" w:lineRule="auto"/>
-            </w:pPr>
-          </w:p>
-          <w:p>
-            <w:pPr>
-              <w:spacing w:line="360" w:lineRule="auto"/>
-            </w:pPr>
-            <w:r>
+              <w:rPr>
+                <w:sz w:val="24"/>
+                <w:szCs w:val="24"/>
+              </w:rPr>
+            </w:pPr>
+          </w:p>
+          <w:p>
+            <w:pPr>
+              <w:spacing w:line="360" w:lineRule="auto"/>
+              <w:rPr>
+                <w:sz w:val="24"/>
+                <w:szCs w:val="24"/>
+              </w:rPr>
+            </w:pPr>
+            <w:r>
+              <w:rPr>
+                <w:sz w:val="24"/>
+                <w:szCs w:val="24"/>
+              </w:rPr>
               <w:t xml:space="preserve">Rabu, 21 Januari 2026</w:t>
             </w:r>
           </w:p>
           <w:p>
             <w:pPr>
               <w:spacing w:line="360" w:lineRule="auto"/>
-            </w:pPr>
-            <w:r>
+              <w:rPr>
+                <w:sz w:val="24"/>
+                <w:szCs w:val="24"/>
+              </w:rPr>
+            </w:pPr>
+            <w:r>
+              <w:rPr>
+                <w:sz w:val="24"/>
+                <w:szCs w:val="24"/>
+              </w:rPr>
               <w:t xml:space="preserve">fdf                                            </w:t>
             </w:r>
           </w:p>
@@ -711,11 +872,15 @@
             <w:pPr>
               <w:spacing w:line="360" w:lineRule="auto"/>
               <w:rPr>
+                <w:sz w:val="24"/>
+                <w:szCs w:val="24"/>
                 <w:lang w:val="sv-SE"/>
               </w:rPr>
             </w:pPr>
             <w:r>
               <w:rPr>
+                <w:sz w:val="24"/>
+                <w:szCs w:val="24"/>
                 <w:lang w:val="sv-SE"/>
               </w:rPr>
               <w:t xml:space="preserve">vvbvn                                             </w:t>
@@ -727,11 +892,25 @@
               <w:rPr>
                 <w:b/>
                 <w:bCs/>
+                <w:sz w:val="24"/>
+                <w:szCs w:val="24"/>
                 <w:lang w:val="sv-SE"/>
               </w:rPr>
             </w:pPr>
             <w:r>
-              <w:t xml:space="preserve">kjkhg                                       </w:t>
+              <w:rPr>
+                <w:sz w:val="24"/>
+                <w:szCs w:val="24"/>
+              </w:rPr>
+              <w:t xml:space="preserve">kjkhg   </w:t>
+            </w:r>
+            <w:proofErr w:type="gramEnd"/>
+            <w:r>
+              <w:rPr>
+                <w:sz w:val="24"/>
+                <w:szCs w:val="24"/>
+              </w:rPr>
+              <w:t xml:space="preserve">                                    </w:t>
             </w:r>
           </w:p>
         </w:tc>
@@ -750,17 +929,33 @@
           <w:p>
             <w:pPr>
               <w:spacing w:line="360" w:lineRule="auto"/>
+              <w:rPr>
+                <w:sz w:val="24"/>
+                <w:szCs w:val="24"/>
+              </w:rPr>
             </w:pPr>
             <w:proofErr w:type="spellStart"/>
             <w:r>
+              <w:rPr>
+                <w:sz w:val="24"/>
+                <w:szCs w:val="24"/>
+              </w:rPr>
               <w:t>Tanggal</w:t>
             </w:r>
             <w:proofErr w:type="spellEnd"/>
             <w:r>
+              <w:rPr>
+                <w:sz w:val="24"/>
+                <w:szCs w:val="24"/>
+              </w:rPr>
               <w:t xml:space="preserve"> </w:t>
             </w:r>
             <w:proofErr w:type="spellStart"/>
             <w:r>
+              <w:rPr>
+                <w:sz w:val="24"/>
+                <w:szCs w:val="24"/>
+              </w:rPr>
               <w:t>Kejadian</w:t>
             </w:r>
             <w:proofErr w:type="spellEnd"/>
@@ -779,8 +974,16 @@
           <w:p>
             <w:pPr>
               <w:spacing w:line="360" w:lineRule="auto"/>
-            </w:pPr>
-            <w:r>
+              <w:rPr>
+                <w:sz w:val="24"/>
+                <w:szCs w:val="24"/>
+              </w:rPr>
+            </w:pPr>
+            <w:r>
+              <w:rPr>
+                <w:sz w:val="24"/>
+                <w:szCs w:val="24"/>
+              </w:rPr>
               <w:t>:</w:t>
             </w:r>
           </w:p>
@@ -798,6 +1001,10 @@
           <w:p>
             <w:pPr>
               <w:spacing w:line="360" w:lineRule="auto"/>
+              <w:rPr>
+                <w:sz w:val="24"/>
+                <w:szCs w:val="24"/>
+              </w:rPr>
             </w:pPr>
           </w:p>
         </w:tc>
@@ -816,12 +1023,24 @@
           <w:p>
             <w:pPr>
               <w:spacing w:line="360" w:lineRule="auto"/>
-            </w:pPr>
-            <w:r>
+              <w:rPr>
+                <w:sz w:val="24"/>
+                <w:szCs w:val="24"/>
+              </w:rPr>
+            </w:pPr>
+            <w:r>
+              <w:rPr>
+                <w:sz w:val="24"/>
+                <w:szCs w:val="24"/>
+              </w:rPr>
               <w:t xml:space="preserve">Nama </w:t>
             </w:r>
             <w:proofErr w:type="spellStart"/>
             <w:r>
+              <w:rPr>
+                <w:sz w:val="24"/>
+                <w:szCs w:val="24"/>
+              </w:rPr>
               <w:t>Pelapor</w:t>
             </w:r>
             <w:proofErr w:type="spellEnd"/>
@@ -840,8 +1059,16 @@
           <w:p>
             <w:pPr>
               <w:spacing w:line="360" w:lineRule="auto"/>
-            </w:pPr>
-            <w:r>
+              <w:rPr>
+                <w:sz w:val="24"/>
+                <w:szCs w:val="24"/>
+              </w:rPr>
+            </w:pPr>
+            <w:r>
+              <w:rPr>
+                <w:sz w:val="24"/>
+                <w:szCs w:val="24"/>
+              </w:rPr>
               <w:t>:</w:t>
             </w:r>
           </w:p>
@@ -859,6 +1086,10 @@
           <w:p>
             <w:pPr>
               <w:spacing w:line="360" w:lineRule="auto"/>
+              <w:rPr>
+                <w:sz w:val="24"/>
+                <w:szCs w:val="24"/>
+              </w:rPr>
             </w:pPr>
           </w:p>
         </w:tc>
@@ -877,12 +1108,24 @@
           <w:p>
             <w:pPr>
               <w:spacing w:line="360" w:lineRule="auto"/>
-            </w:pPr>
-            <w:r>
+              <w:rPr>
+                <w:sz w:val="24"/>
+                <w:szCs w:val="24"/>
+              </w:rPr>
+            </w:pPr>
+            <w:r>
+              <w:rPr>
+                <w:sz w:val="24"/>
+                <w:szCs w:val="24"/>
+              </w:rPr>
               <w:t xml:space="preserve">Nama </w:t>
             </w:r>
             <w:proofErr w:type="spellStart"/>
             <w:r>
+              <w:rPr>
+                <w:sz w:val="24"/>
+                <w:szCs w:val="24"/>
+              </w:rPr>
               <w:t>Bidang</w:t>
             </w:r>
             <w:proofErr w:type="spellEnd"/>
@@ -901,8 +1144,16 @@
           <w:p>
             <w:pPr>
               <w:spacing w:line="360" w:lineRule="auto"/>
-            </w:pPr>
-            <w:r>
+              <w:rPr>
+                <w:sz w:val="24"/>
+                <w:szCs w:val="24"/>
+              </w:rPr>
+            </w:pPr>
+            <w:r>
+              <w:rPr>
+                <w:sz w:val="24"/>
+                <w:szCs w:val="24"/>
+              </w:rPr>
               <w:t>:</w:t>
             </w:r>
           </w:p>
@@ -920,6 +1171,10 @@
           <w:p>
             <w:pPr>
               <w:spacing w:line="360" w:lineRule="auto"/>
+              <w:rPr>
+                <w:sz w:val="24"/>
+                <w:szCs w:val="24"/>
+              </w:rPr>
             </w:pPr>
           </w:p>
         </w:tc>
@@ -938,17 +1193,33 @@
           <w:p>
             <w:pPr>
               <w:spacing w:line="360" w:lineRule="auto"/>
+              <w:rPr>
+                <w:sz w:val="24"/>
+                <w:szCs w:val="24"/>
+              </w:rPr>
             </w:pPr>
             <w:proofErr w:type="spellStart"/>
             <w:r>
+              <w:rPr>
+                <w:sz w:val="24"/>
+                <w:szCs w:val="24"/>
+              </w:rPr>
               <w:t>Deskripsi</w:t>
             </w:r>
             <w:proofErr w:type="spellEnd"/>
             <w:r>
+              <w:rPr>
+                <w:sz w:val="24"/>
+                <w:szCs w:val="24"/>
+              </w:rPr>
               <w:t xml:space="preserve"> </w:t>
             </w:r>
             <w:proofErr w:type="spellStart"/>
             <w:r>
+              <w:rPr>
+                <w:sz w:val="24"/>
+                <w:szCs w:val="24"/>
+              </w:rPr>
               <w:t>insiden</w:t>
             </w:r>
             <w:proofErr w:type="spellEnd"/>
@@ -967,8 +1238,16 @@
           <w:p>
             <w:pPr>
               <w:spacing w:line="360" w:lineRule="auto"/>
-            </w:pPr>
-            <w:r>
+              <w:rPr>
+                <w:sz w:val="24"/>
+                <w:szCs w:val="24"/>
+              </w:rPr>
+            </w:pPr>
+            <w:r>
+              <w:rPr>
+                <w:sz w:val="24"/>
+                <w:szCs w:val="24"/>
+              </w:rPr>
               <w:t>:</w:t>
             </w:r>
           </w:p>
@@ -986,6 +1265,10 @@
           <w:p>
             <w:pPr>
               <w:spacing w:line="360" w:lineRule="auto"/>
+              <w:rPr>
+                <w:sz w:val="24"/>
+                <w:szCs w:val="24"/>
+              </w:rPr>
             </w:pPr>
           </w:p>
         </w:tc>
@@ -1007,9 +1290,17 @@
             <w:pPr>
               <w:spacing w:line="360" w:lineRule="auto"/>
               <w:jc w:val="center"/>
+              <w:rPr>
+                <w:sz w:val="24"/>
+                <w:szCs w:val="24"/>
+              </w:rPr>
             </w:pPr>
             <w:proofErr w:type="spellStart"/>
             <w:r>
+              <w:rPr>
+                <w:sz w:val="24"/>
+                <w:szCs w:val="24"/>
+              </w:rPr>
               <w:t>Pelapor</w:t>
             </w:r>
             <w:proofErr w:type="spellEnd"/>
@@ -1018,8 +1309,16 @@
             <w:pPr>
               <w:spacing w:line="360" w:lineRule="auto"/>
               <w:jc w:val="center"/>
-            </w:pPr>
-            <w:r>
+              <w:rPr>
+                <w:sz w:val="24"/>
+                <w:szCs w:val="24"/>
+              </w:rPr>
+            </w:pPr>
+            <w:r>
+              <w:rPr>
+                <w:sz w:val="24"/>
+                <w:szCs w:val="24"/>
+              </w:rPr>
               <w:t xml:space="preserve"/>
             </w:r>
             <w:r>
@@ -1064,9 +1363,25 @@
             <w:pPr>
               <w:spacing w:line="360" w:lineRule="auto"/>
               <w:jc w:val="center"/>
-            </w:pPr>
-            <w:r>
-              <w:t xml:space="preserve">v                                       </w:t>
+              <w:rPr>
+                <w:sz w:val="24"/>
+                <w:szCs w:val="24"/>
+              </w:rPr>
+            </w:pPr>
+            <w:r>
+              <w:rPr>
+                <w:sz w:val="24"/>
+                <w:szCs w:val="24"/>
+              </w:rPr>
+              <w:t xml:space="preserve">v   </w:t>
+            </w:r>
+            <w:proofErr w:type="gramEnd"/>
+            <w:r>
+              <w:rPr>
+                <w:sz w:val="24"/>
+                <w:szCs w:val="24"/>
+              </w:rPr>
+              <w:t xml:space="preserve">                                    </w:t>
             </w:r>
           </w:p>
         </w:tc>
@@ -1083,17 +1398,33 @@
             <w:pPr>
               <w:spacing w:line="360" w:lineRule="auto"/>
               <w:jc w:val="center"/>
+              <w:rPr>
+                <w:sz w:val="24"/>
+                <w:szCs w:val="24"/>
+              </w:rPr>
             </w:pPr>
             <w:proofErr w:type="spellStart"/>
             <w:r>
+              <w:rPr>
+                <w:sz w:val="24"/>
+                <w:szCs w:val="24"/>
+              </w:rPr>
               <w:t>Atasan</w:t>
             </w:r>
             <w:proofErr w:type="spellEnd"/>
             <w:r>
+              <w:rPr>
+                <w:sz w:val="24"/>
+                <w:szCs w:val="24"/>
+              </w:rPr>
               <w:t xml:space="preserve"> </w:t>
             </w:r>
             <w:proofErr w:type="spellStart"/>
             <w:r>
+              <w:rPr>
+                <w:sz w:val="24"/>
+                <w:szCs w:val="24"/>
+              </w:rPr>
               <w:t>Pelapor</w:t>
             </w:r>
             <w:proofErr w:type="spellEnd"/>
@@ -1102,8 +1433,16 @@
             <w:pPr>
               <w:spacing w:line="360" w:lineRule="auto"/>
               <w:jc w:val="center"/>
-            </w:pPr>
-            <w:r>
+              <w:rPr>
+                <w:sz w:val="24"/>
+                <w:szCs w:val="24"/>
+              </w:rPr>
+            </w:pPr>
+            <w:r>
+              <w:rPr>
+                <w:sz w:val="24"/>
+                <w:szCs w:val="24"/>
+              </w:rPr>
               <w:t xml:space="preserve"/>
             </w:r>
             <w:r>
@@ -1148,9 +1487,25 @@
             <w:pPr>
               <w:spacing w:line="360" w:lineRule="auto"/>
               <w:jc w:val="center"/>
-            </w:pPr>
-            <w:r>
-              <w:t xml:space="preserve">v                                       </w:t>
+              <w:rPr>
+                <w:sz w:val="24"/>
+                <w:szCs w:val="24"/>
+              </w:rPr>
+            </w:pPr>
+            <w:r>
+              <w:rPr>
+                <w:sz w:val="24"/>
+                <w:szCs w:val="24"/>
+              </w:rPr>
+              <w:t xml:space="preserve">v   </w:t>
+            </w:r>
+            <w:proofErr w:type="gramEnd"/>
+            <w:r>
+              <w:rPr>
+                <w:sz w:val="24"/>
+                <w:szCs w:val="24"/>
+              </w:rPr>
+              <w:t xml:space="preserve">                                    </w:t>
             </w:r>
           </w:p>
         </w:tc>
@@ -1172,6 +1527,8 @@
               <w:rPr>
                 <w:b/>
                 <w:bCs/>
+                <w:sz w:val="24"/>
+                <w:szCs w:val="24"/>
               </w:rPr>
             </w:pPr>
             <w:proofErr w:type="spellStart"/>
@@ -1179,6 +1536,8 @@
               <w:rPr>
                 <w:b/>
                 <w:bCs/>
+                <w:sz w:val="24"/>
+                <w:szCs w:val="24"/>
               </w:rPr>
               <w:t>Diisi</w:t>
             </w:r>
@@ -1187,6 +1546,8 @@
               <w:rPr>
                 <w:b/>
                 <w:bCs/>
+                <w:sz w:val="24"/>
+                <w:szCs w:val="24"/>
               </w:rPr>
               <w:t xml:space="preserve"> Oleh SMKI Officer</w:t>
             </w:r>
@@ -1205,6 +1566,10 @@
           <w:p>
             <w:pPr>
               <w:spacing w:line="360" w:lineRule="auto"/>
+              <w:rPr>
+                <w:sz w:val="24"/>
+                <w:szCs w:val="24"/>
+              </w:rPr>
             </w:pPr>
           </w:p>
         </w:tc>
@@ -1222,6 +1587,10 @@
           <w:p>
             <w:pPr>
               <w:spacing w:line="360" w:lineRule="auto"/>
+              <w:rPr>
+                <w:sz w:val="24"/>
+                <w:szCs w:val="24"/>
+              </w:rPr>
             </w:pPr>
           </w:p>
         </w:tc>
@@ -1238,6 +1607,10 @@
           <w:p>
             <w:pPr>
               <w:spacing w:line="360" w:lineRule="auto"/>
+              <w:rPr>
+                <w:sz w:val="24"/>
+                <w:szCs w:val="24"/>
+              </w:rPr>
             </w:pPr>
           </w:p>
         </w:tc>
@@ -1256,16 +1629,32 @@
           <w:p>
             <w:pPr>
               <w:spacing w:line="360" w:lineRule="auto"/>
-            </w:pPr>
-            <w:r>
+              <w:rPr>
+                <w:sz w:val="24"/>
+                <w:szCs w:val="24"/>
+              </w:rPr>
+            </w:pPr>
+            <w:r>
+              <w:rPr>
+                <w:sz w:val="24"/>
+                <w:szCs w:val="24"/>
+              </w:rPr>
               <w:t xml:space="preserve">Jenis </w:t>
             </w:r>
             <w:proofErr w:type="spellStart"/>
             <w:r>
+              <w:rPr>
+                <w:sz w:val="24"/>
+                <w:szCs w:val="24"/>
+              </w:rPr>
               <w:t>Insiden</w:t>
             </w:r>
             <w:proofErr w:type="spellEnd"/>
             <w:r>
+              <w:rPr>
+                <w:sz w:val="24"/>
+                <w:szCs w:val="24"/>
+              </w:rPr>
               <w:t xml:space="preserve"> </w:t>
             </w:r>
           </w:p>
@@ -1283,8 +1672,16 @@
           <w:p>
             <w:pPr>
               <w:spacing w:line="360" w:lineRule="auto"/>
-            </w:pPr>
-            <w:r>
+              <w:rPr>
+                <w:sz w:val="24"/>
+                <w:szCs w:val="24"/>
+              </w:rPr>
+            </w:pPr>
+            <w:r>
+              <w:rPr>
+                <w:sz w:val="24"/>
+                <w:szCs w:val="24"/>
+              </w:rPr>
               <w:t>:</w:t>
             </w:r>
           </w:p>
@@ -1303,9 +1700,25 @@
           <w:p>
             <w:pPr>
               <w:spacing w:line="360" w:lineRule="auto"/>
-            </w:pPr>
-            <w:r>
-              <w:t xml:space="preserve">Keamanan Informasi                       </w:t>
+              <w:rPr>
+                <w:sz w:val="24"/>
+                <w:szCs w:val="24"/>
+              </w:rPr>
+            </w:pPr>
+            <w:r>
+              <w:rPr>
+                <w:sz w:val="24"/>
+                <w:szCs w:val="24"/>
+              </w:rPr>
+              <w:t xml:space="preserve">Keamanan Informasi   </w:t>
+            </w:r>
+            <w:proofErr w:type="gramEnd"/>
+            <w:r>
+              <w:rPr>
+                <w:sz w:val="24"/>
+                <w:szCs w:val="24"/>
+              </w:rPr>
+              <w:t xml:space="preserve">                    </w:t>
             </w:r>
           </w:p>
         </w:tc>
@@ -1322,6 +1735,10 @@
           <w:p>
             <w:pPr>
               <w:spacing w:line="360" w:lineRule="auto"/>
+              <w:rPr>
+                <w:sz w:val="24"/>
+                <w:szCs w:val="24"/>
+              </w:rPr>
             </w:pPr>
           </w:p>
         </w:tc>
@@ -1340,17 +1757,33 @@
           <w:p>
             <w:pPr>
               <w:spacing w:line="360" w:lineRule="auto"/>
+              <w:rPr>
+                <w:sz w:val="24"/>
+                <w:szCs w:val="24"/>
+              </w:rPr>
             </w:pPr>
             <w:proofErr w:type="spellStart"/>
             <w:r>
+              <w:rPr>
+                <w:sz w:val="24"/>
+                <w:szCs w:val="24"/>
+              </w:rPr>
               <w:t>Analisis</w:t>
             </w:r>
             <w:proofErr w:type="spellEnd"/>
             <w:r>
+              <w:rPr>
+                <w:sz w:val="24"/>
+                <w:szCs w:val="24"/>
+              </w:rPr>
               <w:t xml:space="preserve"> </w:t>
             </w:r>
             <w:proofErr w:type="spellStart"/>
             <w:r>
+              <w:rPr>
+                <w:sz w:val="24"/>
+                <w:szCs w:val="24"/>
+              </w:rPr>
               <w:t>Penyebab</w:t>
             </w:r>
             <w:proofErr w:type="spellEnd"/>
@@ -1369,8 +1802,16 @@
           <w:p>
             <w:pPr>
               <w:spacing w:line="360" w:lineRule="auto"/>
-            </w:pPr>
-            <w:r>
+              <w:rPr>
+                <w:sz w:val="24"/>
+                <w:szCs w:val="24"/>
+              </w:rPr>
+            </w:pPr>
+            <w:r>
+              <w:rPr>
+                <w:sz w:val="24"/>
+                <w:szCs w:val="24"/>
+              </w:rPr>
               <w:t>:</w:t>
             </w:r>
           </w:p>
@@ -1389,9 +1830,25 @@
           <w:p>
             <w:pPr>
               <w:spacing w:line="360" w:lineRule="auto"/>
-            </w:pPr>
-            <w:r>
-              <w:t xml:space="preserve">cffxf                    </w:t>
+              <w:rPr>
+                <w:sz w:val="24"/>
+                <w:szCs w:val="24"/>
+              </w:rPr>
+            </w:pPr>
+            <w:r>
+              <w:rPr>
+                <w:sz w:val="24"/>
+                <w:szCs w:val="24"/>
+              </w:rPr>
+              <w:t xml:space="preserve">cffxf   </w:t>
+            </w:r>
+            <w:proofErr w:type="gramEnd"/>
+            <w:r>
+              <w:rPr>
+                <w:sz w:val="24"/>
+                <w:szCs w:val="24"/>
+              </w:rPr>
+              <w:t xml:space="preserve">                 </w:t>
             </w:r>
           </w:p>
         </w:tc>
@@ -1410,30 +1867,58 @@
           <w:p>
             <w:pPr>
               <w:spacing w:line="360" w:lineRule="auto"/>
+              <w:rPr>
+                <w:sz w:val="24"/>
+                <w:szCs w:val="24"/>
+              </w:rPr>
             </w:pPr>
             <w:proofErr w:type="spellStart"/>
             <w:r>
+              <w:rPr>
+                <w:sz w:val="24"/>
+                <w:szCs w:val="24"/>
+              </w:rPr>
               <w:t>Tindak</w:t>
             </w:r>
             <w:proofErr w:type="spellEnd"/>
             <w:r>
+              <w:rPr>
+                <w:sz w:val="24"/>
+                <w:szCs w:val="24"/>
+              </w:rPr>
               <w:t xml:space="preserve"> </w:t>
             </w:r>
             <w:proofErr w:type="spellStart"/>
             <w:r>
+              <w:rPr>
+                <w:sz w:val="24"/>
+                <w:szCs w:val="24"/>
+              </w:rPr>
               <w:t>lanjut</w:t>
             </w:r>
             <w:proofErr w:type="spellEnd"/>
             <w:r>
+              <w:rPr>
+                <w:sz w:val="24"/>
+                <w:szCs w:val="24"/>
+              </w:rPr>
               <w:t xml:space="preserve"> yang</w:t>
             </w:r>
           </w:p>
           <w:p>
             <w:pPr>
               <w:spacing w:line="360" w:lineRule="auto"/>
+              <w:rPr>
+                <w:sz w:val="24"/>
+                <w:szCs w:val="24"/>
+              </w:rPr>
             </w:pPr>
             <w:proofErr w:type="spellStart"/>
             <w:r>
+              <w:rPr>
+                <w:sz w:val="24"/>
+                <w:szCs w:val="24"/>
+              </w:rPr>
               <w:t>dilakukan</w:t>
             </w:r>
             <w:proofErr w:type="spellEnd"/>
@@ -1454,8 +1939,16 @@
             <w:pPr>
               <w:spacing w:line="360" w:lineRule="auto"/>
               <w:jc w:val="center"/>
-            </w:pPr>
-            <w:r>
+              <w:rPr>
+                <w:sz w:val="24"/>
+                <w:szCs w:val="24"/>
+              </w:rPr>
+            </w:pPr>
+            <w:r>
+              <w:rPr>
+                <w:sz w:val="24"/>
+                <w:szCs w:val="24"/>
+              </w:rPr>
               <w:t>:</w:t>
             </w:r>
           </w:p>
@@ -1475,9 +1968,25 @@
           <w:p>
             <w:pPr>
               <w:spacing w:line="360" w:lineRule="auto"/>
-            </w:pPr>
-            <w:r>
-              <w:t xml:space="preserve">hggd                         </w:t>
+              <w:rPr>
+                <w:sz w:val="24"/>
+                <w:szCs w:val="24"/>
+              </w:rPr>
+            </w:pPr>
+            <w:r>
+              <w:rPr>
+                <w:sz w:val="24"/>
+                <w:szCs w:val="24"/>
+              </w:rPr>
+              <w:t xml:space="preserve">hggd   </w:t>
+            </w:r>
+            <w:proofErr w:type="gramEnd"/>
+            <w:r>
+              <w:rPr>
+                <w:sz w:val="24"/>
+                <w:szCs w:val="24"/>
+              </w:rPr>
+              <w:t xml:space="preserve">                      </w:t>
             </w:r>
           </w:p>
         </w:tc>
@@ -1494,6 +2003,10 @@
           <w:p>
             <w:pPr>
               <w:spacing w:line="360" w:lineRule="auto"/>
+              <w:rPr>
+                <w:sz w:val="24"/>
+                <w:szCs w:val="24"/>
+              </w:rPr>
             </w:pPr>
           </w:p>
         </w:tc>
@@ -1512,20 +2025,40 @@
           <w:p>
             <w:pPr>
               <w:spacing w:line="360" w:lineRule="auto"/>
-            </w:pPr>
-            <w:r>
+              <w:rPr>
+                <w:sz w:val="24"/>
+                <w:szCs w:val="24"/>
+              </w:rPr>
+            </w:pPr>
+            <w:r>
+              <w:rPr>
+                <w:sz w:val="24"/>
+                <w:szCs w:val="24"/>
+              </w:rPr>
               <w:t xml:space="preserve">PIC </w:t>
             </w:r>
             <w:proofErr w:type="spellStart"/>
             <w:r>
+              <w:rPr>
+                <w:sz w:val="24"/>
+                <w:szCs w:val="24"/>
+              </w:rPr>
               <w:t>Tindak</w:t>
             </w:r>
             <w:proofErr w:type="spellEnd"/>
             <w:r>
+              <w:rPr>
+                <w:sz w:val="24"/>
+                <w:szCs w:val="24"/>
+              </w:rPr>
               <w:t xml:space="preserve"> </w:t>
             </w:r>
             <w:proofErr w:type="spellStart"/>
             <w:r>
+              <w:rPr>
+                <w:sz w:val="24"/>
+                <w:szCs w:val="24"/>
+              </w:rPr>
               <w:t>Lanjut</w:t>
             </w:r>
             <w:proofErr w:type="spellEnd"/>
@@ -1543,8 +2076,16 @@
           <w:p>
             <w:pPr>
               <w:spacing w:line="360" w:lineRule="auto"/>
-            </w:pPr>
-            <w:r>
+              <w:rPr>
+                <w:sz w:val="24"/>
+                <w:szCs w:val="24"/>
+              </w:rPr>
+            </w:pPr>
+            <w:r>
+              <w:rPr>
+                <w:sz w:val="24"/>
+                <w:szCs w:val="24"/>
+              </w:rPr>
               <w:t>:</w:t>
             </w:r>
           </w:p>
@@ -1562,9 +2103,25 @@
           <w:p>
             <w:pPr>
               <w:spacing w:line="360" w:lineRule="auto"/>
-            </w:pPr>
-            <w:r>
-              <w:t xml:space="preserve">dfjk                          </w:t>
+              <w:rPr>
+                <w:sz w:val="24"/>
+                <w:szCs w:val="24"/>
+              </w:rPr>
+            </w:pPr>
+            <w:r>
+              <w:rPr>
+                <w:sz w:val="24"/>
+                <w:szCs w:val="24"/>
+              </w:rPr>
+              <w:t xml:space="preserve">dfjk   </w:t>
+            </w:r>
+            <w:proofErr w:type="gramEnd"/>
+            <w:r>
+              <w:rPr>
+                <w:sz w:val="24"/>
+                <w:szCs w:val="24"/>
+              </w:rPr>
+              <w:t xml:space="preserve">                       </w:t>
             </w:r>
           </w:p>
         </w:tc>
@@ -1580,6 +2137,10 @@
           <w:p>
             <w:pPr>
               <w:spacing w:line="360" w:lineRule="auto"/>
+              <w:rPr>
+                <w:sz w:val="24"/>
+                <w:szCs w:val="24"/>
+              </w:rPr>
             </w:pPr>
           </w:p>
         </w:tc>
@@ -1601,8 +2162,16 @@
             <w:pPr>
               <w:spacing w:line="360" w:lineRule="auto"/>
               <w:jc w:val="center"/>
-            </w:pPr>
-            <w:r>
+              <w:rPr>
+                <w:sz w:val="24"/>
+                <w:szCs w:val="24"/>
+              </w:rPr>
+            </w:pPr>
+            <w:r>
+              <w:rPr>
+                <w:sz w:val="24"/>
+                <w:szCs w:val="24"/>
+              </w:rPr>
               <w:t>SMKI Officer</w:t>
             </w:r>
           </w:p>
@@ -1610,8 +2179,16 @@
             <w:pPr>
               <w:spacing w:line="360" w:lineRule="auto"/>
               <w:jc w:val="center"/>
-            </w:pPr>
-            <w:r>
+              <w:rPr>
+                <w:sz w:val="24"/>
+                <w:szCs w:val="24"/>
+              </w:rPr>
+            </w:pPr>
+            <w:r>
+              <w:rPr>
+                <w:sz w:val="24"/>
+                <w:szCs w:val="24"/>
+              </w:rPr>
               <w:t xml:space="preserve"/>
             </w:r>
             <w:r>
@@ -1656,9 +2233,31 @@
             <w:pPr>
               <w:spacing w:line="360" w:lineRule="auto"/>
               <w:jc w:val="center"/>
-            </w:pPr>
-            <w:r>
-              <w:t xml:space="preserve">c                                       </w:t>
+              <w:rPr>
+                <w:b/>
+                <w:bCs/>
+                <w:sz w:val="24"/>
+                <w:szCs w:val="24"/>
+              </w:rPr>
+            </w:pPr>
+            <w:r>
+              <w:rPr>
+                <w:b/>
+                <w:bCs/>
+                <w:sz w:val="24"/>
+                <w:szCs w:val="24"/>
+              </w:rPr>
+              <w:t xml:space="preserve">c   </w:t>
+            </w:r>
+            <w:proofErr w:type="gramEnd"/>
+            <w:r>
+              <w:rPr>
+                <w:b/>
+                <w:bCs/>
+                <w:sz w:val="24"/>
+                <w:szCs w:val="24"/>
+              </w:rPr>
+              <w:t xml:space="preserve">                                    </w:t>
             </w:r>
           </w:p>
         </w:tc>
@@ -1675,13 +2274,25 @@
             <w:pPr>
               <w:spacing w:line="360" w:lineRule="auto"/>
               <w:jc w:val="center"/>
+              <w:rPr>
+                <w:sz w:val="24"/>
+                <w:szCs w:val="24"/>
+              </w:rPr>
             </w:pPr>
             <w:proofErr w:type="spellStart"/>
             <w:r>
+              <w:rPr>
+                <w:sz w:val="24"/>
+                <w:szCs w:val="24"/>
+              </w:rPr>
               <w:t>Ketua</w:t>
             </w:r>
             <w:proofErr w:type="spellEnd"/>
             <w:r>
+              <w:rPr>
+                <w:sz w:val="24"/>
+                <w:szCs w:val="24"/>
+              </w:rPr>
               <w:t xml:space="preserve"> Tim IRKJ</w:t>
             </w:r>
           </w:p>
@@ -1689,8 +2300,16 @@
             <w:pPr>
               <w:spacing w:line="360" w:lineRule="auto"/>
               <w:jc w:val="center"/>
-            </w:pPr>
-            <w:r>
+              <w:rPr>
+                <w:sz w:val="24"/>
+                <w:szCs w:val="24"/>
+              </w:rPr>
+            </w:pPr>
+            <w:r>
+              <w:rPr>
+                <w:sz w:val="24"/>
+                <w:szCs w:val="24"/>
+              </w:rPr>
               <w:t xml:space="preserve"/>
             </w:r>
             <w:r>
@@ -1735,9 +2354,31 @@
             <w:pPr>
               <w:spacing w:line="360" w:lineRule="auto"/>
               <w:jc w:val="center"/>
-            </w:pPr>
-            <w:r>
-              <w:t xml:space="preserve">b                                       </w:t>
+              <w:rPr>
+                <w:b/>
+                <w:bCs/>
+                <w:sz w:val="24"/>
+                <w:szCs w:val="24"/>
+              </w:rPr>
+            </w:pPr>
+            <w:r>
+              <w:rPr>
+                <w:b/>
+                <w:bCs/>
+                <w:sz w:val="24"/>
+                <w:szCs w:val="24"/>
+              </w:rPr>
+              <w:t xml:space="preserve">b   </w:t>
+            </w:r>
+            <w:proofErr w:type="gramEnd"/>
+            <w:r>
+              <w:rPr>
+                <w:b/>
+                <w:bCs/>
+                <w:sz w:val="24"/>
+                <w:szCs w:val="24"/>
+              </w:rPr>
+              <w:t xml:space="preserve">                                    </w:t>
             </w:r>
           </w:p>
         </w:tc>
@@ -1759,6 +2400,8 @@
               <w:rPr>
                 <w:b/>
                 <w:bCs/>
+                <w:sz w:val="24"/>
+                <w:szCs w:val="24"/>
               </w:rPr>
             </w:pPr>
             <w:proofErr w:type="spellStart"/>
@@ -1766,6 +2409,8 @@
               <w:rPr>
                 <w:b/>
                 <w:bCs/>
+                <w:sz w:val="24"/>
+                <w:szCs w:val="24"/>
               </w:rPr>
               <w:t>Diisi</w:t>
             </w:r>
@@ -1774,6 +2419,8 @@
               <w:rPr>
                 <w:b/>
                 <w:bCs/>
+                <w:sz w:val="24"/>
+                <w:szCs w:val="24"/>
               </w:rPr>
               <w:t xml:space="preserve"> oleh </w:t>
             </w:r>
@@ -1782,6 +2429,8 @@
               <w:rPr>
                 <w:b/>
                 <w:bCs/>
+                <w:sz w:val="24"/>
+                <w:szCs w:val="24"/>
               </w:rPr>
               <w:t>Pihak</w:t>
             </w:r>
@@ -1790,6 +2439,8 @@
               <w:rPr>
                 <w:b/>
                 <w:bCs/>
+                <w:sz w:val="24"/>
+                <w:szCs w:val="24"/>
               </w:rPr>
               <w:t xml:space="preserve"> </w:t>
             </w:r>
@@ -1798,6 +2449,8 @@
               <w:rPr>
                 <w:b/>
                 <w:bCs/>
+                <w:sz w:val="24"/>
+                <w:szCs w:val="24"/>
               </w:rPr>
               <w:t>Terkait</w:t>
             </w:r>
@@ -1817,6 +2470,10 @@
           <w:p>
             <w:pPr>
               <w:spacing w:line="360" w:lineRule="auto"/>
+              <w:rPr>
+                <w:sz w:val="24"/>
+                <w:szCs w:val="24"/>
+              </w:rPr>
             </w:pPr>
           </w:p>
         </w:tc>
@@ -1834,6 +2491,10 @@
           <w:p>
             <w:pPr>
               <w:spacing w:line="360" w:lineRule="auto"/>
+              <w:rPr>
+                <w:sz w:val="24"/>
+                <w:szCs w:val="24"/>
+              </w:rPr>
             </w:pPr>
           </w:p>
         </w:tc>
@@ -1850,6 +2511,10 @@
           <w:p>
             <w:pPr>
               <w:spacing w:line="360" w:lineRule="auto"/>
+              <w:rPr>
+                <w:sz w:val="24"/>
+                <w:szCs w:val="24"/>
+              </w:rPr>
             </w:pPr>
           </w:p>
         </w:tc>
@@ -1869,44 +2534,46 @@
             <w:pPr>
               <w:spacing w:line="360" w:lineRule="auto"/>
               <w:rPr>
+                <w:sz w:val="24"/>
+                <w:szCs w:val="24"/>
                 <w:lang w:val="sv-SE"/>
               </w:rPr>
             </w:pPr>
             <w:r>
               <w:rPr>
+                <w:sz w:val="24"/>
+                <w:szCs w:val="24"/>
                 <w:lang w:val="sv-SE"/>
               </w:rPr>
-              <w:t>Tindak lanjut yang di l</w:t>
-            </w:r>
-            <w:r>
-              <w:rPr>
+              <w:t>Tindak lanjut yang di lakukan</w:t>
+            </w:r>
+          </w:p>
+        </w:tc>
+        <w:tc>
+          <w:tcPr>
+            <w:tcW w:w="284" w:type="dxa"/>
+            <w:tcBorders>
+              <w:top w:val="nil"/>
+              <w:left w:val="nil"/>
+              <w:bottom w:val="single" w:sz="12" w:space="0" w:color="auto"/>
+              <w:right w:val="nil"/>
+            </w:tcBorders>
+            <w:vAlign w:val="center"/>
+          </w:tcPr>
+          <w:p>
+            <w:pPr>
+              <w:spacing w:line="360" w:lineRule="auto"/>
+              <w:jc w:val="center"/>
+              <w:rPr>
+                <w:sz w:val="24"/>
+                <w:szCs w:val="24"/>
                 <w:lang w:val="sv-SE"/>
               </w:rPr>
-              <w:t>akukan</w:t>
-            </w:r>
-          </w:p>
-        </w:tc>
-        <w:tc>
-          <w:tcPr>
-            <w:tcW w:w="284" w:type="dxa"/>
-            <w:tcBorders>
-              <w:top w:val="nil"/>
-              <w:left w:val="nil"/>
-              <w:bottom w:val="single" w:sz="12" w:space="0" w:color="auto"/>
-              <w:right w:val="nil"/>
-            </w:tcBorders>
-            <w:vAlign w:val="center"/>
-          </w:tcPr>
-          <w:p>
-            <w:pPr>
-              <w:spacing w:line="360" w:lineRule="auto"/>
-              <w:jc w:val="center"/>
-              <w:rPr>
-                <w:lang w:val="sv-SE"/>
-              </w:rPr>
-            </w:pPr>
-            <w:r>
-              <w:rPr>
+            </w:pPr>
+            <w:r>
+              <w:rPr>
+                <w:sz w:val="24"/>
+                <w:szCs w:val="24"/>
                 <w:lang w:val="sv-SE"/>
               </w:rPr>
               <w:t>:</w:t>
@@ -1929,11 +2596,25 @@
             <w:pPr>
               <w:spacing w:line="360" w:lineRule="auto"/>
               <w:rPr>
+                <w:sz w:val="24"/>
+                <w:szCs w:val="24"/>
                 <w:lang w:val="sv-SE"/>
               </w:rPr>
             </w:pPr>
             <w:r>
-              <w:t xml:space="preserve">xcvb                        </w:t>
+              <w:rPr>
+                <w:sz w:val="24"/>
+                <w:szCs w:val="24"/>
+              </w:rPr>
+              <w:t xml:space="preserve">xcvb   </w:t>
+            </w:r>
+            <w:proofErr w:type="gramEnd"/>
+            <w:r>
+              <w:rPr>
+                <w:sz w:val="24"/>
+                <w:szCs w:val="24"/>
+              </w:rPr>
+              <w:t xml:space="preserve">                     </w:t>
             </w:r>
           </w:p>
         </w:tc>
@@ -1951,6 +2632,8 @@
             <w:pPr>
               <w:spacing w:line="360" w:lineRule="auto"/>
               <w:rPr>
+                <w:sz w:val="24"/>
+                <w:szCs w:val="24"/>
                 <w:lang w:val="sv-SE"/>
               </w:rPr>
             </w:pPr>
@@ -1974,6 +2657,8 @@
               <w:rPr>
                 <w:b/>
                 <w:bCs/>
+                <w:sz w:val="24"/>
+                <w:szCs w:val="24"/>
                 <w:lang w:val="sv-SE"/>
               </w:rPr>
             </w:pPr>
@@ -1981,6 +2666,8 @@
               <w:rPr>
                 <w:b/>
                 <w:bCs/>
+                <w:sz w:val="24"/>
+                <w:szCs w:val="24"/>
                 <w:lang w:val="sv-SE"/>
               </w:rPr>
               <w:t xml:space="preserve">Diisi oleh SMKI Officer</w:t>
@@ -2001,6 +2688,8 @@
             <w:pPr>
               <w:spacing w:line="360" w:lineRule="auto"/>
               <w:rPr>
+                <w:sz w:val="24"/>
+                <w:szCs w:val="24"/>
                 <w:lang w:val="sv-SE"/>
               </w:rPr>
             </w:pPr>
@@ -2020,6 +2709,8 @@
             <w:pPr>
               <w:spacing w:line="360" w:lineRule="auto"/>
               <w:rPr>
+                <w:sz w:val="24"/>
+                <w:szCs w:val="24"/>
                 <w:lang w:val="sv-SE"/>
               </w:rPr>
             </w:pPr>
@@ -2028,11 +2719,15 @@
             <w:pPr>
               <w:spacing w:line="360" w:lineRule="auto"/>
               <w:rPr>
+                <w:sz w:val="24"/>
+                <w:szCs w:val="24"/>
                 <w:lang w:val="fi-FI"/>
               </w:rPr>
             </w:pPr>
             <w:r>
               <w:rPr>
+                <w:sz w:val="24"/>
+                <w:szCs w:val="24"/>
                 <w:lang w:val="fi-FI"/>
               </w:rPr>
               <w:t xml:space="preserve">✓ Ya                                              </w:t>
@@ -2042,11 +2737,15 @@
             <w:pPr>
               <w:spacing w:line="360" w:lineRule="auto"/>
               <w:rPr>
+                <w:sz w:val="24"/>
+                <w:szCs w:val="24"/>
                 <w:lang w:val="sv-SE"/>
               </w:rPr>
             </w:pPr>
             <w:r>
               <w:rPr>
+                <w:sz w:val="24"/>
+                <w:szCs w:val="24"/>
                 <w:lang w:val="fi-FI"/>
               </w:rPr>
               <w:t xml:space="preserve">Rabu, 21 Januari 2026                                       </w:t>
@@ -2069,11 +2768,15 @@
             <w:pPr>
               <w:spacing w:line="360" w:lineRule="auto"/>
               <w:rPr>
+                <w:sz w:val="24"/>
+                <w:szCs w:val="24"/>
                 <w:lang w:val="sv-SE"/>
               </w:rPr>
             </w:pPr>
             <w:r>
               <w:rPr>
+                <w:sz w:val="24"/>
+                <w:szCs w:val="24"/>
                 <w:lang w:val="sv-SE"/>
               </w:rPr>
               <w:t>Insiden Selesai</w:t>
@@ -2094,11 +2797,15 @@
             <w:pPr>
               <w:spacing w:line="360" w:lineRule="auto"/>
               <w:rPr>
+                <w:sz w:val="24"/>
+                <w:szCs w:val="24"/>
                 <w:lang w:val="sv-SE"/>
               </w:rPr>
             </w:pPr>
             <w:r>
               <w:rPr>
+                <w:sz w:val="24"/>
+                <w:szCs w:val="24"/>
                 <w:lang w:val="sv-SE"/>
               </w:rPr>
               <w:t>:</w:t>
@@ -2119,6 +2826,8 @@
             <w:pPr>
               <w:spacing w:line="360" w:lineRule="auto"/>
               <w:rPr>
+                <w:sz w:val="24"/>
+                <w:szCs w:val="24"/>
                 <w:lang w:val="sv-SE"/>
               </w:rPr>
             </w:pPr>
@@ -2140,11 +2849,15 @@
             <w:pPr>
               <w:spacing w:line="360" w:lineRule="auto"/>
               <w:rPr>
+                <w:sz w:val="24"/>
+                <w:szCs w:val="24"/>
                 <w:lang w:val="sv-SE"/>
               </w:rPr>
             </w:pPr>
             <w:r>
               <w:rPr>
+                <w:sz w:val="24"/>
+                <w:szCs w:val="24"/>
                 <w:lang w:val="sv-SE"/>
               </w:rPr>
               <w:t>Tanggal Penyelesaian</w:t>
@@ -2165,11 +2878,15 @@
             <w:pPr>
               <w:spacing w:line="360" w:lineRule="auto"/>
               <w:rPr>
+                <w:sz w:val="24"/>
+                <w:szCs w:val="24"/>
                 <w:lang w:val="sv-SE"/>
               </w:rPr>
             </w:pPr>
             <w:r>
               <w:rPr>
+                <w:sz w:val="24"/>
+                <w:szCs w:val="24"/>
                 <w:lang w:val="sv-SE"/>
               </w:rPr>
               <w:t>:</w:t>
@@ -2191,6 +2908,8 @@
             <w:pPr>
               <w:spacing w:line="360" w:lineRule="auto"/>
               <w:rPr>
+                <w:sz w:val="24"/>
+                <w:szCs w:val="24"/>
                 <w:lang w:val="sv-SE"/>
               </w:rPr>
             </w:pPr>
@@ -2215,8 +2934,16 @@
             <w:pPr>
               <w:spacing w:line="360" w:lineRule="auto"/>
               <w:jc w:val="center"/>
-            </w:pPr>
-            <w:r>
+              <w:rPr>
+                <w:sz w:val="24"/>
+                <w:szCs w:val="24"/>
+              </w:rPr>
+            </w:pPr>
+            <w:r>
+              <w:rPr>
+                <w:sz w:val="24"/>
+                <w:szCs w:val="24"/>
+              </w:rPr>
               <w:t xml:space="preserve">SMKI Officer</w:t>
             </w:r>
           </w:p>
@@ -2224,8 +2951,16 @@
             <w:pPr>
               <w:spacing w:line="360" w:lineRule="auto"/>
               <w:jc w:val="center"/>
-            </w:pPr>
-            <w:r>
+              <w:rPr>
+                <w:sz w:val="24"/>
+                <w:szCs w:val="24"/>
+              </w:rPr>
+            </w:pPr>
+            <w:r>
+              <w:rPr>
+                <w:sz w:val="24"/>
+                <w:szCs w:val="24"/>
+              </w:rPr>
               <w:t xml:space="preserve"/>
             </w:r>
             <w:r>
@@ -2271,11 +3006,31 @@
               <w:spacing w:line="360" w:lineRule="auto"/>
               <w:jc w:val="center"/>
               <w:rPr>
+                <w:b/>
+                <w:bCs/>
+                <w:sz w:val="24"/>
+                <w:szCs w:val="24"/>
                 <w:lang w:val="sv-SE"/>
               </w:rPr>
             </w:pPr>
             <w:r>
-              <w:t xml:space="preserve">n                                                                                   </w:t>
+              <w:rPr>
+                <w:b/>
+                <w:bCs/>
+                <w:sz w:val="24"/>
+                <w:szCs w:val="24"/>
+              </w:rPr>
+              <w:t xml:space="preserve">n   </w:t>
+            </w:r>
+            <w:proofErr w:type="gramEnd"/>
+            <w:r>
+              <w:rPr>
+                <w:b/>
+                <w:bCs/>
+                <w:sz w:val="24"/>
+                <w:szCs w:val="24"/>
+              </w:rPr>
+              <w:t xml:space="preserve">                                                                                </w:t>
             </w:r>
           </w:p>
         </w:tc>

</xml_diff>